<commit_message>
Fix four mangled table numbers, tighten the typography
The section-renumbering script left "@@Table IIII@@" and "@@Table IIV@@" in
four places, two of them table captions, so the paper printed garbage where it
should have printed Table III and Table IV. Captions now read I through V in
order, and no placeholder survives.

Leading to 1.07, wide figures to 86%, references to 7.7pt. That is partial
progress toward nine pages; it is still ten.

Co-Authored-By: Claude Opus 5 <noreply@anthropic.com>
</commit_message>
<xml_diff>
--- a/TeamSync_IEEE_Paper.docx
+++ b/TeamSync_IEEE_Paper.docx
@@ -3291,7 +3291,7 @@
           <w:i w:val="0"/>
           <w:sz w:val="20"/>
         </w:rPr>
-        <w:t>@@Table IIII@@ and Fig. 2 give the efficiency result, measured identically for both architectures. As the project grows from 13 to 2,003 tasks, a factor of 154, the graph-grounded prompt grows from 266 to 390 tokens, a factor of 1.47. Naive full-dataset prompting grows from 1,050 to 189,834 tokens. At the largest size the ratio is 486.8×, a 99.8% reduction.</w:t>
+        <w:t>Table III and Fig. 2 give the efficiency result, measured identically for both architectures. As the project grows from 13 to 2,003 tasks, a factor of 154, the graph-grounded prompt grows from 266 to 390 tokens, a factor of 1.47. Naive full-dataset prompting grows from 1,050 to 189,834 tokens. At the largest size the ratio is 486.8×, a 99.8% reduction.</w:t>
       </w:r>
     </w:p>
     <w:p>
@@ -3321,7 +3321,7 @@
           <w:rFonts w:ascii="Times New Roman" w:hAnsi="Times New Roman"/>
           <w:sz w:val="16"/>
         </w:rPr>
-        <w:t>@@TABLE IIII@@</w:t>
+        <w:t>TABLE III</w:t>
       </w:r>
     </w:p>
     <w:p>
@@ -4068,7 +4068,7 @@
           <w:i w:val="0"/>
           <w:sz w:val="20"/>
         </w:rPr>
-        <w:t>This is the result that answers a question a project manager actually has, at a time when the answer can still change what they do. At each checkpoint the sprint is reconstructed as it then stood, the share of scope still unfinished at the deadline is projected from work completed against time elapsed, and delay risk is raised using the same severity cut-offs the product uses everywhere else. Nothing was tuned for this experiment. @@Table IIV@@ reports the 270 held-out sprints from 22 unseen projects.</w:t>
+        <w:t>This is the result that answers a question a project manager actually has, at a time when the answer can still change what they do. At each checkpoint the sprint is reconstructed as it then stood, the share of scope still unfinished at the deadline is projected from work completed against time elapsed, and delay risk is raised using the same severity cut-offs the product uses everywhere else. Nothing was tuned for this experiment. Table IV reports the 270 held-out sprints from 22 unseen projects.</w:t>
       </w:r>
     </w:p>
     <w:p>
@@ -4093,7 +4093,7 @@
           <w:rFonts w:ascii="Times New Roman" w:hAnsi="Times New Roman"/>
           <w:sz w:val="16"/>
         </w:rPr>
-        <w:t>@@TABLE IIV@@</w:t>
+        <w:t>TABLE IV</w:t>
       </w:r>
     </w:p>
     <w:p>

</xml_diff>